<commit_message>
Fuller 1-page Acast CV: all relevant experience, no overflow, no padding
Rebuilt to keep all substantive content (full profile, complete skills,
all five experience bullets, education with dates, all certifications) on
a single page via tighter layout -- rather than trimming experience to fit.

Co-Authored-By: Claude Opus 4.8 <noreply@anthropic.com>
Claude-Session: https://claude.ai/code/session_01MzGn1HJ4AwPX1XircaZM7i
</commit_message>
<xml_diff>
--- a/cv/tailored/31518608__acast.docx
+++ b/cv/tailored/31518608__acast.docx
@@ -4,7 +4,7 @@
   <w:body>
     <w:p>
       <w:pPr>
-        <w:spacing w:after="20"/>
+        <w:spacing w:after="18"/>
       </w:pPr>
       <w:r>
         <w:rPr>
@@ -20,7 +20,7 @@
     </w:p>
     <w:p>
       <w:pPr>
-        <w:spacing w:after="20"/>
+        <w:spacing w:after="16"/>
       </w:pPr>
       <w:r>
         <w:rPr>
@@ -28,199 +28,224 @@
           <w:b/>
           <w:bCs/>
           <w:color w:val="1F4E5F"/>
+          <w:sz w:val="18"/>
+          <w:szCs w:val="18"/>
+        </w:rPr>
+        <w:t xml:space="preserve">Data &amp; BI Specialist  |  Power BI &amp; Tableau Developer  |  Data Visualisation Consultant</w:t>
+      </w:r>
+    </w:p>
+    <w:p>
+      <w:pPr>
+        <w:spacing w:after="40"/>
+      </w:pPr>
+      <w:r>
+        <w:rPr>
+          <w:rFonts w:ascii="Open Sans" w:cs="Open Sans" w:eastAsia="Open Sans" w:hAnsi="Open Sans"/>
+          <w:color w:val="555555"/>
+          <w:sz w:val="16"/>
+          <w:szCs w:val="16"/>
+        </w:rPr>
+        <w:t xml:space="preserve">Lund, Sweden  ·  sam.apanisile@gmail.com  ·  076 460 0461  ·  Tableau Public featured author</w:t>
+      </w:r>
+    </w:p>
+    <w:p>
+      <w:pPr>
+        <w:pBdr>
+          <w:bottom w:val="single" w:color="1F4E5F" w:sz="6" w:space="2"/>
+        </w:pBdr>
+        <w:spacing w:after="46" w:before="104"/>
+      </w:pPr>
+      <w:r>
+        <w:rPr>
+          <w:rFonts w:ascii="Open Sans" w:cs="Open Sans" w:eastAsia="Open Sans" w:hAnsi="Open Sans"/>
+          <w:b/>
+          <w:bCs/>
+          <w:color w:val="1F4E5F"/>
+          <w:spacing w:val="24"/>
+          <w:sz w:val="17"/>
+          <w:szCs w:val="17"/>
+        </w:rPr>
+        <w:t xml:space="preserve">PROFILE</w:t>
+      </w:r>
+    </w:p>
+    <w:p>
+      <w:pPr>
+        <w:spacing w:after="40" w:line="232"/>
+      </w:pPr>
+      <w:r>
+        <w:rPr>
+          <w:rFonts w:ascii="Open Sans" w:cs="Open Sans" w:eastAsia="Open Sans" w:hAnsi="Open Sans"/>
+          <w:color w:val="1A1A1A"/>
+          <w:sz w:val="18"/>
+          <w:szCs w:val="18"/>
+        </w:rPr>
+        <w:t xml:space="preserve">Data &amp; BI specialist who turns half-formed stakeholder questions into trusted data models and dashboards people actually use. I partner across Finance, Product and commercial teams, translate business logic into clean semantic and star-schema models, and accelerate analytics delivery with AI tools (Claude, ChatGPT). Tableau Public featured author; MSc Data Analytics &amp; Business Economics, Lund University.</w:t>
+      </w:r>
+    </w:p>
+    <w:p>
+      <w:pPr>
+        <w:pBdr>
+          <w:bottom w:val="single" w:color="1F4E5F" w:sz="6" w:space="2"/>
+        </w:pBdr>
+        <w:spacing w:after="46" w:before="104"/>
+      </w:pPr>
+      <w:r>
+        <w:rPr>
+          <w:rFonts w:ascii="Open Sans" w:cs="Open Sans" w:eastAsia="Open Sans" w:hAnsi="Open Sans"/>
+          <w:b/>
+          <w:bCs/>
+          <w:color w:val="1F4E5F"/>
+          <w:spacing w:val="24"/>
+          <w:sz w:val="17"/>
+          <w:szCs w:val="17"/>
+        </w:rPr>
+        <w:t xml:space="preserve">CORE SKILLS</w:t>
+      </w:r>
+    </w:p>
+    <w:p>
+      <w:pPr>
+        <w:spacing w:after="28" w:line="232"/>
+      </w:pPr>
+      <w:r>
+        <w:rPr>
+          <w:rFonts w:ascii="Open Sans" w:cs="Open Sans" w:eastAsia="Open Sans" w:hAnsi="Open Sans"/>
+          <w:b/>
+          <w:bCs/>
+          <w:color w:val="1A1A1A"/>
+          <w:sz w:val="18"/>
+          <w:szCs w:val="18"/>
+        </w:rPr>
+        <w:t xml:space="preserve">BI &amp; Dashboards:  </w:t>
+      </w:r>
+      <w:r>
+        <w:rPr>
+          <w:rFonts w:ascii="Open Sans" w:cs="Open Sans" w:eastAsia="Open Sans" w:hAnsi="Open Sans"/>
+          <w:color w:val="1A1A1A"/>
+          <w:sz w:val="18"/>
+          <w:szCs w:val="18"/>
+        </w:rPr>
+        <w:t xml:space="preserve">Tableau, Power BI, Looker, Advanced Excel, RLS (row-level security)</w:t>
+      </w:r>
+    </w:p>
+    <w:p>
+      <w:pPr>
+        <w:spacing w:after="28" w:line="232"/>
+      </w:pPr>
+      <w:r>
+        <w:rPr>
+          <w:rFonts w:ascii="Open Sans" w:cs="Open Sans" w:eastAsia="Open Sans" w:hAnsi="Open Sans"/>
+          <w:b/>
+          <w:bCs/>
+          <w:color w:val="1A1A1A"/>
+          <w:sz w:val="18"/>
+          <w:szCs w:val="18"/>
+        </w:rPr>
+        <w:t xml:space="preserve">Data &amp; Warehouse:  </w:t>
+      </w:r>
+      <w:r>
+        <w:rPr>
+          <w:rFonts w:ascii="Open Sans" w:cs="Open Sans" w:eastAsia="Open Sans" w:hAnsi="Open Sans"/>
+          <w:color w:val="1A1A1A"/>
+          <w:sz w:val="18"/>
+          <w:szCs w:val="18"/>
+        </w:rPr>
+        <w:t xml:space="preserve">SQL, BigQuery, Snowflake, Microsoft Fabric, ETL</w:t>
+      </w:r>
+    </w:p>
+    <w:p>
+      <w:pPr>
+        <w:spacing w:after="28" w:line="232"/>
+      </w:pPr>
+      <w:r>
+        <w:rPr>
+          <w:rFonts w:ascii="Open Sans" w:cs="Open Sans" w:eastAsia="Open Sans" w:hAnsi="Open Sans"/>
+          <w:b/>
+          <w:bCs/>
+          <w:color w:val="1A1A1A"/>
+          <w:sz w:val="18"/>
+          <w:szCs w:val="18"/>
+        </w:rPr>
+        <w:t xml:space="preserve">Modelling:  </w:t>
+      </w:r>
+      <w:r>
+        <w:rPr>
+          <w:rFonts w:ascii="Open Sans" w:cs="Open Sans" w:eastAsia="Open Sans" w:hAnsi="Open Sans"/>
+          <w:color w:val="1A1A1A"/>
+          <w:sz w:val="18"/>
+          <w:szCs w:val="18"/>
+        </w:rPr>
+        <w:t xml:space="preserve">Star schema, semantic models, joins &amp; aggregations, data quality &amp; governance</w:t>
+      </w:r>
+    </w:p>
+    <w:p>
+      <w:pPr>
+        <w:spacing w:after="40" w:line="232"/>
+      </w:pPr>
+      <w:r>
+        <w:rPr>
+          <w:rFonts w:ascii="Open Sans" w:cs="Open Sans" w:eastAsia="Open Sans" w:hAnsi="Open Sans"/>
+          <w:b/>
+          <w:bCs/>
+          <w:color w:val="1A1A1A"/>
+          <w:sz w:val="18"/>
+          <w:szCs w:val="18"/>
+        </w:rPr>
+        <w:t xml:space="preserve">Also:  </w:t>
+      </w:r>
+      <w:r>
+        <w:rPr>
+          <w:rFonts w:ascii="Open Sans" w:cs="Open Sans" w:eastAsia="Open Sans" w:hAnsi="Open Sans"/>
+          <w:color w:val="1A1A1A"/>
+          <w:sz w:val="18"/>
+          <w:szCs w:val="18"/>
+        </w:rPr>
+        <w:t xml:space="preserve">Python, machine learning, AI-assisted analytics (Claude, Gemini, ChatGPT), root-cause analysis, Agile, Google Analytics</w:t>
+      </w:r>
+    </w:p>
+    <w:p>
+      <w:pPr>
+        <w:pBdr>
+          <w:bottom w:val="single" w:color="1F4E5F" w:sz="6" w:space="2"/>
+        </w:pBdr>
+        <w:spacing w:after="46" w:before="104"/>
+      </w:pPr>
+      <w:r>
+        <w:rPr>
+          <w:rFonts w:ascii="Open Sans" w:cs="Open Sans" w:eastAsia="Open Sans" w:hAnsi="Open Sans"/>
+          <w:b/>
+          <w:bCs/>
+          <w:color w:val="1F4E5F"/>
+          <w:spacing w:val="24"/>
+          <w:sz w:val="17"/>
+          <w:szCs w:val="17"/>
+        </w:rPr>
+        <w:t xml:space="preserve">EXPERIENCE</w:t>
+      </w:r>
+    </w:p>
+    <w:p>
+      <w:pPr>
+        <w:tabs>
+          <w:tab w:val="right" w:pos="10466"/>
+        </w:tabs>
+        <w:spacing w:after="32"/>
+      </w:pPr>
+      <w:r>
+        <w:rPr>
+          <w:rFonts w:ascii="Open Sans" w:cs="Open Sans" w:eastAsia="Open Sans" w:hAnsi="Open Sans"/>
+          <w:b/>
+          <w:bCs/>
+          <w:color w:val="1A1A1A"/>
           <w:sz w:val="19"/>
           <w:szCs w:val="19"/>
         </w:rPr>
-        <w:t xml:space="preserve">Data &amp; BI Specialist  |  Power BI &amp; Tableau Developer  |  Data Visualisation</w:t>
-      </w:r>
-    </w:p>
-    <w:p>
-      <w:pPr>
-        <w:spacing w:after="60"/>
-      </w:pPr>
+        <w:t xml:space="preserve">Data Visualisation &amp; BI Consultant</w:t>
+      </w:r>
       <w:r>
         <w:rPr>
           <w:rFonts w:ascii="Open Sans" w:cs="Open Sans" w:eastAsia="Open Sans" w:hAnsi="Open Sans"/>
           <w:color w:val="555555"/>
           <w:sz w:val="17"/>
           <w:szCs w:val="17"/>
-        </w:rPr>
-        <w:t xml:space="preserve">Lund, Sweden  ·  sam.apanisile@gmail.com  ·  076 460 0461  ·  Tableau Public featured author</w:t>
-      </w:r>
-    </w:p>
-    <w:p>
-      <w:pPr>
-        <w:pBdr>
-          <w:bottom w:val="single" w:color="1F4E5F" w:sz="6" w:space="2"/>
-        </w:pBdr>
-        <w:spacing w:after="50" w:before="120"/>
-      </w:pPr>
-      <w:r>
-        <w:rPr>
-          <w:rFonts w:ascii="Open Sans" w:cs="Open Sans" w:eastAsia="Open Sans" w:hAnsi="Open Sans"/>
-          <w:b/>
-          <w:bCs/>
-          <w:color w:val="1F4E5F"/>
-          <w:spacing w:val="20"/>
-          <w:sz w:val="18"/>
-          <w:szCs w:val="18"/>
-        </w:rPr>
-        <w:t xml:space="preserve">PROFILE</w:t>
-      </w:r>
-    </w:p>
-    <w:p>
-      <w:pPr>
-        <w:spacing w:after="60" w:line="240"/>
-      </w:pPr>
-      <w:r>
-        <w:rPr>
-          <w:rFonts w:ascii="Open Sans" w:cs="Open Sans" w:eastAsia="Open Sans" w:hAnsi="Open Sans"/>
-          <w:color w:val="1A1A1A"/>
-          <w:sz w:val="19"/>
-          <w:szCs w:val="19"/>
-        </w:rPr>
-        <w:t xml:space="preserve">BI specialist who turns half-formed stakeholder questions into trusted data models and dashboards people actually use. Comfortable partnering across Finance, Product and commercial teams, translating business logic into clean semantic and star-schema models, and accelerating analytics delivery with AI tools (Claude, ChatGPT). MSc Data Analytics &amp; Business Economics, Lund University.</w:t>
-      </w:r>
-    </w:p>
-    <w:p>
-      <w:pPr>
-        <w:pBdr>
-          <w:bottom w:val="single" w:color="1F4E5F" w:sz="6" w:space="2"/>
-        </w:pBdr>
-        <w:spacing w:after="50" w:before="120"/>
-      </w:pPr>
-      <w:r>
-        <w:rPr>
-          <w:rFonts w:ascii="Open Sans" w:cs="Open Sans" w:eastAsia="Open Sans" w:hAnsi="Open Sans"/>
-          <w:b/>
-          <w:bCs/>
-          <w:color w:val="1F4E5F"/>
-          <w:spacing w:val="20"/>
-          <w:sz w:val="18"/>
-          <w:szCs w:val="18"/>
-        </w:rPr>
-        <w:t xml:space="preserve">CORE SKILLS</w:t>
-      </w:r>
-    </w:p>
-    <w:p>
-      <w:pPr>
-        <w:spacing w:after="30" w:line="240"/>
-      </w:pPr>
-      <w:r>
-        <w:rPr>
-          <w:rFonts w:ascii="Open Sans" w:cs="Open Sans" w:eastAsia="Open Sans" w:hAnsi="Open Sans"/>
-          <w:b/>
-          <w:bCs/>
-          <w:color w:val="1A1A1A"/>
-          <w:sz w:val="18"/>
-          <w:szCs w:val="18"/>
-        </w:rPr>
-        <w:t xml:space="preserve">BI &amp; Dashboards: </w:t>
-      </w:r>
-      <w:r>
-        <w:rPr>
-          <w:rFonts w:ascii="Open Sans" w:cs="Open Sans" w:eastAsia="Open Sans" w:hAnsi="Open Sans"/>
-          <w:color w:val="1A1A1A"/>
-          <w:sz w:val="18"/>
-          <w:szCs w:val="18"/>
-        </w:rPr>
-        <w:t xml:space="preserve">Tableau, Power BI, Looker, RLS, Advanced Excel</w:t>
-      </w:r>
-    </w:p>
-    <w:p>
-      <w:pPr>
-        <w:spacing w:after="30" w:line="240"/>
-      </w:pPr>
-      <w:r>
-        <w:rPr>
-          <w:rFonts w:ascii="Open Sans" w:cs="Open Sans" w:eastAsia="Open Sans" w:hAnsi="Open Sans"/>
-          <w:b/>
-          <w:bCs/>
-          <w:color w:val="1A1A1A"/>
-          <w:sz w:val="18"/>
-          <w:szCs w:val="18"/>
-        </w:rPr>
-        <w:t xml:space="preserve">Data &amp; Modelling: </w:t>
-      </w:r>
-      <w:r>
-        <w:rPr>
-          <w:rFonts w:ascii="Open Sans" w:cs="Open Sans" w:eastAsia="Open Sans" w:hAnsi="Open Sans"/>
-          <w:color w:val="1A1A1A"/>
-          <w:sz w:val="18"/>
-          <w:szCs w:val="18"/>
-        </w:rPr>
-        <w:t xml:space="preserve">SQL, BigQuery, Snowflake, Microsoft Fabric, star schema, semantic models, ETL</w:t>
-      </w:r>
-    </w:p>
-    <w:p>
-      <w:pPr>
-        <w:spacing w:after="60" w:line="240"/>
-      </w:pPr>
-      <w:r>
-        <w:rPr>
-          <w:rFonts w:ascii="Open Sans" w:cs="Open Sans" w:eastAsia="Open Sans" w:hAnsi="Open Sans"/>
-          <w:b/>
-          <w:bCs/>
-          <w:color w:val="1A1A1A"/>
-          <w:sz w:val="18"/>
-          <w:szCs w:val="18"/>
-        </w:rPr>
-        <w:t xml:space="preserve">Also: </w:t>
-      </w:r>
-      <w:r>
-        <w:rPr>
-          <w:rFonts w:ascii="Open Sans" w:cs="Open Sans" w:eastAsia="Open Sans" w:hAnsi="Open Sans"/>
-          <w:color w:val="1A1A1A"/>
-          <w:sz w:val="18"/>
-          <w:szCs w:val="18"/>
-        </w:rPr>
-        <w:t xml:space="preserve">Python, machine learning, data quality &amp; governance, AI-assisted analytics (Claude, Gemini, ChatGPT), Agile</w:t>
-      </w:r>
-    </w:p>
-    <w:p>
-      <w:pPr>
-        <w:pBdr>
-          <w:bottom w:val="single" w:color="1F4E5F" w:sz="6" w:space="2"/>
-        </w:pBdr>
-        <w:spacing w:after="50" w:before="120"/>
-      </w:pPr>
-      <w:r>
-        <w:rPr>
-          <w:rFonts w:ascii="Open Sans" w:cs="Open Sans" w:eastAsia="Open Sans" w:hAnsi="Open Sans"/>
-          <w:b/>
-          <w:bCs/>
-          <w:color w:val="1F4E5F"/>
-          <w:spacing w:val="20"/>
-          <w:sz w:val="18"/>
-          <w:szCs w:val="18"/>
-        </w:rPr>
-        <w:t xml:space="preserve">EXPERIENCE</w:t>
-      </w:r>
-    </w:p>
-    <w:p>
-      <w:pPr>
-        <w:tabs>
-          <w:tab w:val="right" w:pos="10318"/>
-        </w:tabs>
-        <w:spacing w:after="20"/>
-      </w:pPr>
-      <w:r>
-        <w:rPr>
-          <w:rFonts w:ascii="Open Sans" w:cs="Open Sans" w:eastAsia="Open Sans" w:hAnsi="Open Sans"/>
-          <w:b/>
-          <w:bCs/>
-          <w:color w:val="1A1A1A"/>
-          <w:sz w:val="20"/>
-          <w:szCs w:val="20"/>
-        </w:rPr>
-        <w:t xml:space="preserve">Data Visualisation &amp; BI Consultant</w:t>
-      </w:r>
-      <w:r>
-        <w:rPr>
-          <w:rFonts w:ascii="Open Sans" w:cs="Open Sans" w:eastAsia="Open Sans" w:hAnsi="Open Sans"/>
-          <w:color w:val="555555"/>
-          <w:sz w:val="18"/>
-          <w:szCs w:val="18"/>
         </w:rPr>
         <w:t xml:space="preserve">	Vizpulse Studios LLC  ·  Apr 2022 – Jun 2026</w:t>
       </w:r>
@@ -232,16 +257,16 @@
           <w:ilvl w:val="0"/>
           <w:numId w:val="2"/>
         </w:numPr>
-        <w:spacing w:after="40" w:line="240"/>
-      </w:pPr>
-      <w:r>
-        <w:rPr>
-          <w:rFonts w:ascii="Open Sans" w:cs="Open Sans" w:eastAsia="Open Sans" w:hAnsi="Open Sans"/>
-          <w:color w:val="1A1A1A"/>
-          <w:sz w:val="18"/>
-          <w:szCs w:val="18"/>
-        </w:rPr>
-        <w:t xml:space="preserve">Partnered with stakeholders across development and commercial teams to translate operational questions into technical requirements, KPIs, semantic models and dashboards that tracked engagement and interventions.</w:t>
+        <w:spacing w:after="46" w:line="232"/>
+      </w:pPr>
+      <w:r>
+        <w:rPr>
+          <w:rFonts w:ascii="Open Sans" w:cs="Open Sans" w:eastAsia="Open Sans" w:hAnsi="Open Sans"/>
+          <w:color w:val="1A1A1A"/>
+          <w:sz w:val="18"/>
+          <w:szCs w:val="18"/>
+        </w:rPr>
+        <w:t xml:space="preserve">Partnered with stakeholders across development and commercial sectors to translate operational questions into technical data requirements and KPIs, building semantic models and dashboards that tracked community engagement and interventions.</w:t>
       </w:r>
     </w:p>
     <w:p>
@@ -251,16 +276,16 @@
           <w:ilvl w:val="0"/>
           <w:numId w:val="2"/>
         </w:numPr>
-        <w:spacing w:after="40" w:line="240"/>
-      </w:pPr>
-      <w:r>
-        <w:rPr>
-          <w:rFonts w:ascii="Open Sans" w:cs="Open Sans" w:eastAsia="Open Sans" w:hAnsi="Open Sans"/>
-          <w:color w:val="1A1A1A"/>
-          <w:sz w:val="18"/>
-          <w:szCs w:val="18"/>
-        </w:rPr>
-        <w:t xml:space="preserve">Built interactive Tableau reporting suites analysing channel performance and user behaviour, helping cross-functional teams spot drop-offs and optimise product adoption.</w:t>
+        <w:spacing w:after="46" w:line="232"/>
+      </w:pPr>
+      <w:r>
+        <w:rPr>
+          <w:rFonts w:ascii="Open Sans" w:cs="Open Sans" w:eastAsia="Open Sans" w:hAnsi="Open Sans"/>
+          <w:color w:val="1A1A1A"/>
+          <w:sz w:val="18"/>
+          <w:szCs w:val="18"/>
+        </w:rPr>
+        <w:t xml:space="preserve">Developed interactive Tableau reporting suites analysing channel performance and user behaviour, enabling cross-functional stakeholders to identify drop-offs and optimise product adoption.</w:t>
       </w:r>
     </w:p>
     <w:p>
@@ -270,16 +295,16 @@
           <w:ilvl w:val="0"/>
           <w:numId w:val="2"/>
         </w:numPr>
-        <w:spacing w:after="40" w:line="240"/>
-      </w:pPr>
-      <w:r>
-        <w:rPr>
-          <w:rFonts w:ascii="Open Sans" w:cs="Open Sans" w:eastAsia="Open Sans" w:hAnsi="Open Sans"/>
-          <w:color w:val="1A1A1A"/>
-          <w:sz w:val="18"/>
-          <w:szCs w:val="18"/>
-        </w:rPr>
-        <w:t xml:space="preserve">Designed robust star-schema data models with clean relationships to handle complex many-to-many business logic, and engineered scalable, validated data pipelines that cut errors and scaled reporting across 20+ counties.</w:t>
+        <w:spacing w:after="46" w:line="232"/>
+      </w:pPr>
+      <w:r>
+        <w:rPr>
+          <w:rFonts w:ascii="Open Sans" w:cs="Open Sans" w:eastAsia="Open Sans" w:hAnsi="Open Sans"/>
+          <w:color w:val="1A1A1A"/>
+          <w:sz w:val="18"/>
+          <w:szCs w:val="18"/>
+        </w:rPr>
+        <w:t xml:space="preserve">Designed robust star-schema data models with clean relationships to handle complex many-to-many business logic, and engineered scalable, validated data pipelines that reduced errors and scaled reporting across 20+ counties.</w:t>
       </w:r>
     </w:p>
     <w:p>
@@ -289,16 +314,35 @@
           <w:ilvl w:val="0"/>
           <w:numId w:val="2"/>
         </w:numPr>
-        <w:spacing w:after="40" w:line="240"/>
-      </w:pPr>
-      <w:r>
-        <w:rPr>
-          <w:rFonts w:ascii="Open Sans" w:cs="Open Sans" w:eastAsia="Open Sans" w:hAnsi="Open Sans"/>
-          <w:color w:val="1A1A1A"/>
-          <w:sz w:val="18"/>
-          <w:szCs w:val="18"/>
-        </w:rPr>
-        <w:t xml:space="preserve">Delivered open-data and public-facing analytics with municipal and agency leadership, standardising disparate metrics into accessible, trusted reporting.</w:t>
+        <w:spacing w:after="46" w:line="232"/>
+      </w:pPr>
+      <w:r>
+        <w:rPr>
+          <w:rFonts w:ascii="Open Sans" w:cs="Open Sans" w:eastAsia="Open Sans" w:hAnsi="Open Sans"/>
+          <w:color w:val="1A1A1A"/>
+          <w:sz w:val="18"/>
+          <w:szCs w:val="18"/>
+        </w:rPr>
+        <w:t xml:space="preserve">Built unified open-data repositories standardising disparate state and local metrics into accessible reporting, driving data maturity and transparent cross-agency collaboration.</w:t>
+      </w:r>
+    </w:p>
+    <w:p>
+      <w:pPr>
+        <w:pStyle w:val="ListParagraph"/>
+        <w:numPr>
+          <w:ilvl w:val="0"/>
+          <w:numId w:val="2"/>
+        </w:numPr>
+        <w:spacing w:after="40" w:line="232"/>
+      </w:pPr>
+      <w:r>
+        <w:rPr>
+          <w:rFonts w:ascii="Open Sans" w:cs="Open Sans" w:eastAsia="Open Sans" w:hAnsi="Open Sans"/>
+          <w:color w:val="1A1A1A"/>
+          <w:sz w:val="18"/>
+          <w:szCs w:val="18"/>
+        </w:rPr>
+        <w:t xml:space="preserve">Delivered public-facing analytical solutions with municipal county leadership, improving transparency of sensitive data to support data-informed intervention policy.</w:t>
       </w:r>
     </w:p>
     <w:p>
@@ -306,7 +350,7 @@
         <w:pBdr>
           <w:bottom w:val="single" w:color="1F4E5F" w:sz="6" w:space="2"/>
         </w:pBdr>
-        <w:spacing w:after="50" w:before="120"/>
+        <w:spacing w:after="46" w:before="104"/>
       </w:pPr>
       <w:r>
         <w:rPr>
@@ -314,16 +358,19 @@
           <w:b/>
           <w:bCs/>
           <w:color w:val="1F4E5F"/>
-          <w:spacing w:val="20"/>
-          <w:sz w:val="18"/>
-          <w:szCs w:val="18"/>
-        </w:rPr>
-        <w:t xml:space="preserve">EDUCATION &amp; CERTIFICATIONS</w:t>
-      </w:r>
-    </w:p>
-    <w:p>
-      <w:pPr>
-        <w:spacing w:after="30" w:line="240"/>
+          <w:spacing w:val="24"/>
+          <w:sz w:val="17"/>
+          <w:szCs w:val="17"/>
+        </w:rPr>
+        <w:t xml:space="preserve">EDUCATION</w:t>
+      </w:r>
+    </w:p>
+    <w:p>
+      <w:pPr>
+        <w:tabs>
+          <w:tab w:val="right" w:pos="10466"/>
+        </w:tabs>
+        <w:spacing w:after="26" w:line="232"/>
       </w:pPr>
       <w:r>
         <w:rPr>
@@ -340,11 +387,19 @@
         <w:rPr>
           <w:rFonts w:ascii="Open Sans" w:cs="Open Sans" w:eastAsia="Open Sans" w:hAnsi="Open Sans"/>
           <w:color w:val="555555"/>
-          <w:sz w:val="18"/>
-          <w:szCs w:val="18"/>
-        </w:rPr>
-        <w:t xml:space="preserve">, Lund University (2026)   ·   </w:t>
-      </w:r>
+          <w:sz w:val="17"/>
+          <w:szCs w:val="17"/>
+        </w:rPr>
+        <w:t xml:space="preserve">	Lund University  ·  2026</w:t>
+      </w:r>
+    </w:p>
+    <w:p>
+      <w:pPr>
+        <w:tabs>
+          <w:tab w:val="right" w:pos="10466"/>
+        </w:tabs>
+        <w:spacing w:after="40" w:line="232"/>
+      </w:pPr>
       <w:r>
         <w:rPr>
           <w:rFonts w:ascii="Open Sans" w:cs="Open Sans" w:eastAsia="Open Sans" w:hAnsi="Open Sans"/>
@@ -360,40 +415,49 @@
         <w:rPr>
           <w:rFonts w:ascii="Open Sans" w:cs="Open Sans" w:eastAsia="Open Sans" w:hAnsi="Open Sans"/>
           <w:color w:val="555555"/>
-          <w:sz w:val="18"/>
-          <w:szCs w:val="18"/>
-        </w:rPr>
-        <w:t xml:space="preserve">, Adekunle Ajasin University (2020)</w:t>
-      </w:r>
-    </w:p>
-    <w:p>
-      <w:pPr>
-        <w:spacing w:after="0" w:line="240"/>
-      </w:pPr>
-      <w:r>
-        <w:rPr>
-          <w:rFonts w:ascii="Open Sans" w:cs="Open Sans" w:eastAsia="Open Sans" w:hAnsi="Open Sans"/>
-          <w:b/>
-          <w:bCs/>
-          <w:color w:val="1A1A1A"/>
-          <w:sz w:val="18"/>
-          <w:szCs w:val="18"/>
-        </w:rPr>
-        <w:t xml:space="preserve">Certifications: </w:t>
-      </w:r>
-      <w:r>
-        <w:rPr>
-          <w:rFonts w:ascii="Open Sans" w:cs="Open Sans" w:eastAsia="Open Sans" w:hAnsi="Open Sans"/>
-          <w:color w:val="1A1A1A"/>
-          <w:sz w:val="18"/>
-          <w:szCs w:val="18"/>
-        </w:rPr>
-        <w:t xml:space="preserve">Tableau Desktop Specialist · Google Business Intelligence · Master Data Management</w:t>
+          <w:sz w:val="17"/>
+          <w:szCs w:val="17"/>
+        </w:rPr>
+        <w:t xml:space="preserve">	Adekunle Ajasin University  ·  2020</w:t>
+      </w:r>
+    </w:p>
+    <w:p>
+      <w:pPr>
+        <w:pBdr>
+          <w:bottom w:val="single" w:color="1F4E5F" w:sz="6" w:space="2"/>
+        </w:pBdr>
+        <w:spacing w:after="46" w:before="104"/>
+      </w:pPr>
+      <w:r>
+        <w:rPr>
+          <w:rFonts w:ascii="Open Sans" w:cs="Open Sans" w:eastAsia="Open Sans" w:hAnsi="Open Sans"/>
+          <w:b/>
+          <w:bCs/>
+          <w:color w:val="1F4E5F"/>
+          <w:spacing w:val="24"/>
+          <w:sz w:val="17"/>
+          <w:szCs w:val="17"/>
+        </w:rPr>
+        <w:t xml:space="preserve">CERTIFICATIONS</w:t>
+      </w:r>
+    </w:p>
+    <w:p>
+      <w:pPr>
+        <w:spacing w:after="0" w:line="232"/>
+      </w:pPr>
+      <w:r>
+        <w:rPr>
+          <w:rFonts w:ascii="Open Sans" w:cs="Open Sans" w:eastAsia="Open Sans" w:hAnsi="Open Sans"/>
+          <w:color w:val="1A1A1A"/>
+          <w:sz w:val="18"/>
+          <w:szCs w:val="18"/>
+        </w:rPr>
+        <w:t xml:space="preserve">Tableau Desktop Specialist  ·  Google Business Intelligence  ·  Master Data Management  ·  Digital Marketing Foundations</w:t>
       </w:r>
     </w:p>
     <w:sectPr>
       <w:pgSz w:w="11906" w:h="16838" w:orient="portrait"/>
-      <w:pgMar w:top="737" w:right="794" w:bottom="737" w:left="794" w:header="708" w:footer="708" w:gutter="0"/>
+      <w:pgMar w:top="680" w:right="720" w:bottom="620" w:left="720" w:header="708" w:footer="708" w:gutter="0"/>
       <w:pgNumType/>
       <w:docGrid w:linePitch="360"/>
     </w:sectPr>
@@ -573,7 +637,7 @@
       <w:lvlText w:val="•"/>
       <w:lvlJc w:val="left"/>
       <w:pPr>
-        <w:ind w:left="216" w:hanging="144"/>
+        <w:ind w:left="200" w:hanging="140"/>
       </w:pPr>
       <w:rPr>
         <w:color w:val="1F4E5F"/>

</xml_diff>